<commit_message>
Justify manuscript and supplementary body text
</commit_message>
<xml_diff>
--- a/manuscript/manuscript_submission.docx
+++ b/manuscript/manuscript_submission.docx
@@ -85,6 +85,9 @@
       </w:r>
     </w:p>
     <w:p>
+      <w:pPr>
+        <w:jc w:val="left"/>
+      </w:pPr>
       <w:r>
         <w:rPr>
           <w:sz w:val="20"/>
@@ -93,6 +96,9 @@
       </w:r>
     </w:p>
     <w:p>
+      <w:pPr>
+        <w:jc w:val="left"/>
+      </w:pPr>
       <w:r>
         <w:rPr>
           <w:sz w:val="20"/>
@@ -101,6 +107,9 @@
       </w:r>
     </w:p>
     <w:p>
+      <w:pPr>
+        <w:jc w:val="left"/>
+      </w:pPr>
       <w:r>
         <w:rPr>
           <w:sz w:val="20"/>
@@ -109,6 +118,9 @@
       </w:r>
     </w:p>
     <w:p>
+      <w:pPr>
+        <w:jc w:val="left"/>
+      </w:pPr>
       <w:r>
         <w:rPr>
           <w:sz w:val="20"/>
@@ -117,6 +129,9 @@
       </w:r>
     </w:p>
     <w:p>
+      <w:pPr>
+        <w:jc w:val="left"/>
+      </w:pPr>
       <w:r>
         <w:rPr>
           <w:sz w:val="20"/>
@@ -125,6 +140,9 @@
       </w:r>
     </w:p>
     <w:p>
+      <w:pPr>
+        <w:jc w:val="left"/>
+      </w:pPr>
       <w:r>
         <w:rPr>
           <w:sz w:val="20"/>
@@ -141,6 +159,7 @@
     <w:p>
       <w:pPr>
         <w:pStyle w:val="Heading1"/>
+        <w:jc w:val="left"/>
       </w:pPr>
       <w:bookmarkStart w:id="0" w:name="abstract"/>
       <w:r>
@@ -217,6 +236,9 @@
       </w:r>
     </w:p>
     <w:p>
+      <w:pPr>
+        <w:jc w:val="left"/>
+      </w:pPr>
       <w:r>
         <w:br w:type="page"/>
       </w:r>
@@ -224,7 +246,7 @@
     <w:p>
       <w:pPr>
         <w:pStyle w:val="Heading1"/>
-        <w:jc w:val="both"/>
+        <w:jc w:val="left"/>
       </w:pPr>
       <w:bookmarkStart w:id="1" w:name="introduction"/>
       <w:bookmarkEnd w:id="0"/>
@@ -387,6 +409,9 @@
       </w:r>
     </w:p>
     <w:p>
+      <w:pPr>
+        <w:jc w:val="left"/>
+      </w:pPr>
       <w:r>
         <w:br w:type="page"/>
       </w:r>
@@ -394,7 +419,7 @@
     <w:p>
       <w:pPr>
         <w:pStyle w:val="Heading1"/>
-        <w:jc w:val="both"/>
+        <w:jc w:val="left"/>
       </w:pPr>
       <w:bookmarkStart w:id="2" w:name="materials-methods"/>
       <w:bookmarkEnd w:id="1"/>
@@ -406,7 +431,7 @@
     <w:p>
       <w:pPr>
         <w:pStyle w:val="Heading2"/>
-        <w:jc w:val="both"/>
+        <w:jc w:val="left"/>
       </w:pPr>
       <w:bookmarkStart w:id="3" w:name="participants"/>
       <w:r>
@@ -525,7 +550,7 @@
     <w:p>
       <w:pPr>
         <w:pStyle w:val="Heading2"/>
-        <w:jc w:val="both"/>
+        <w:jc w:val="left"/>
       </w:pPr>
       <w:bookmarkStart w:id="4" w:name="instrumentation"/>
       <w:bookmarkEnd w:id="3"/>
@@ -609,7 +634,7 @@
     <w:p>
       <w:pPr>
         <w:pStyle w:val="Heading2"/>
-        <w:jc w:val="both"/>
+        <w:jc w:val="left"/>
       </w:pPr>
       <w:bookmarkStart w:id="5" w:name="protocol"/>
       <w:bookmarkEnd w:id="4"/>
@@ -637,7 +662,7 @@
     <w:p>
       <w:pPr>
         <w:pStyle w:val="Heading2"/>
-        <w:jc w:val="both"/>
+        <w:jc w:val="left"/>
       </w:pPr>
       <w:bookmarkStart w:id="6" w:name="signal-preprocessing"/>
       <w:bookmarkEnd w:id="5"/>
@@ -719,7 +744,7 @@
       <w:pPr>
         <w:pStyle w:val="BlockText"/>
         <w:keepLines/>
-        <w:jc w:val="both"/>
+        <w:jc w:val="left"/>
         <w:rPr>
           <w:i/>
           <w:iCs/>
@@ -765,7 +790,7 @@
     <w:p>
       <w:pPr>
         <w:pStyle w:val="Heading2"/>
-        <w:jc w:val="both"/>
+        <w:jc w:val="left"/>
       </w:pPr>
       <w:bookmarkStart w:id="7" w:name="sec:events"/>
       <w:bookmarkEnd w:id="6"/>
@@ -797,7 +822,7 @@
     <w:p>
       <w:pPr>
         <w:pStyle w:val="Heading2"/>
-        <w:jc w:val="both"/>
+        <w:jc w:val="left"/>
       </w:pPr>
       <w:bookmarkStart w:id="8" w:name="sec:stance"/>
       <w:bookmarkEnd w:id="7"/>
@@ -880,7 +905,7 @@
     <w:p>
       <w:pPr>
         <w:pStyle w:val="Heading2"/>
-        <w:jc w:val="both"/>
+        <w:jc w:val="left"/>
       </w:pPr>
       <w:bookmarkStart w:id="9" w:name="zupt-stride-length-integration"/>
       <w:bookmarkEnd w:id="8"/>
@@ -923,7 +948,7 @@
     <w:p>
       <w:pPr>
         <w:pStyle w:val="Heading3"/>
-        <w:jc w:val="both"/>
+        <w:jc w:val="left"/>
       </w:pPr>
       <w:bookmarkStart w:id="10" w:name="orientation-tracking"/>
       <w:r>
@@ -1085,7 +1110,7 @@
     <w:p>
       <w:pPr>
         <w:pStyle w:val="Heading3"/>
-        <w:jc w:val="both"/>
+        <w:jc w:val="left"/>
       </w:pPr>
       <w:bookmarkStart w:id="11" w:name="X2fb5b7dfecd7ae0fb648b723dd4b486fcaafee1"/>
       <w:bookmarkEnd w:id="10"/>
@@ -1117,7 +1142,7 @@
     <w:p>
       <w:pPr>
         <w:pStyle w:val="Heading3"/>
-        <w:jc w:val="both"/>
+        <w:jc w:val="left"/>
       </w:pPr>
       <w:bookmarkStart w:id="12" w:name="retroactive-gravity-residual-correction"/>
       <w:bookmarkEnd w:id="11"/>
@@ -1415,7 +1440,7 @@
     <w:p>
       <w:pPr>
         <w:pStyle w:val="Heading3"/>
-        <w:jc w:val="both"/>
+        <w:jc w:val="left"/>
       </w:pPr>
       <w:bookmarkStart w:id="13" w:name="algorithm-summary"/>
       <w:bookmarkEnd w:id="12"/>
@@ -1451,6 +1476,7 @@
         <w:pStyle w:val="BlockText"/>
         <w:keepNext/>
         <w:keepLines/>
+        <w:jc w:val="left"/>
         <w:rPr>
           <w:b/>
           <w:bCs/>
@@ -1469,6 +1495,7 @@
         <w:pStyle w:val="BlockText"/>
         <w:keepNext/>
         <w:keepLines/>
+        <w:jc w:val="left"/>
       </w:pPr>
       <w:r>
         <w:rPr>
@@ -1486,7 +1513,7 @@
     <w:p>
       <w:pPr>
         <w:pStyle w:val="Heading2"/>
-        <w:jc w:val="both"/>
+        <w:jc w:val="left"/>
       </w:pPr>
       <w:bookmarkStart w:id="14" w:name="sec:matching"/>
       <w:bookmarkEnd w:id="9"/>
@@ -1543,7 +1570,7 @@
     <w:p>
       <w:pPr>
         <w:pStyle w:val="Heading2"/>
-        <w:jc w:val="both"/>
+        <w:jc w:val="left"/>
       </w:pPr>
       <w:bookmarkStart w:id="15" w:name="sec:outcomes"/>
       <w:bookmarkEnd w:id="14"/>
@@ -1699,6 +1726,9 @@
       </w:r>
     </w:p>
     <w:p>
+      <w:pPr>
+        <w:jc w:val="left"/>
+      </w:pPr>
       <w:r>
         <w:br w:type="page"/>
       </w:r>
@@ -1706,6 +1736,7 @@
     <w:p>
       <w:pPr>
         <w:pStyle w:val="Heading1"/>
+        <w:jc w:val="left"/>
       </w:pPr>
       <w:bookmarkStart w:id="16" w:name="results"/>
       <w:bookmarkEnd w:id="2"/>
@@ -1718,7 +1749,7 @@
     <w:p>
       <w:pPr>
         <w:pStyle w:val="Heading2"/>
-        <w:jc w:val="both"/>
+        <w:jc w:val="left"/>
       </w:pPr>
       <w:bookmarkStart w:id="17" w:name="gait-event-detection-accuracy"/>
       <w:r>
@@ -1752,7 +1783,7 @@
         <w:pStyle w:val="BlockText"/>
         <w:keepNext/>
         <w:keepLines/>
-        <w:jc w:val="both"/>
+        <w:jc w:val="left"/>
       </w:pPr>
       <w:r>
         <w:rPr>
@@ -1781,7 +1812,7 @@
       <w:pPr>
         <w:pStyle w:val="BlockText"/>
         <w:keepLines/>
-        <w:jc w:val="both"/>
+        <w:jc w:val="left"/>
         <w:rPr>
           <w:i/>
           <w:iCs/>
@@ -1803,7 +1834,7 @@
     <w:p>
       <w:pPr>
         <w:pStyle w:val="Heading2"/>
-        <w:jc w:val="both"/>
+        <w:jc w:val="left"/>
       </w:pPr>
       <w:bookmarkStart w:id="18" w:name="Xd86e64a745c46e2bf38b636da7693d2091dbbe3"/>
       <w:bookmarkEnd w:id="17"/>
@@ -1857,6 +1888,7 @@
         <w:pStyle w:val="BlockText"/>
         <w:keepNext/>
         <w:keepLines/>
+        <w:jc w:val="left"/>
       </w:pPr>
       <w:r>
         <w:rPr>
@@ -1886,7 +1918,7 @@
       <w:pPr>
         <w:pStyle w:val="BlockText"/>
         <w:keepLines/>
-        <w:jc w:val="both"/>
+        <w:jc w:val="left"/>
         <w:rPr>
           <w:i/>
           <w:iCs/>
@@ -1924,7 +1956,7 @@
     <w:p>
       <w:pPr>
         <w:pStyle w:val="Heading2"/>
-        <w:jc w:val="both"/>
+        <w:jc w:val="left"/>
       </w:pPr>
       <w:bookmarkStart w:id="19" w:name="sec:results_accuracy"/>
       <w:bookmarkEnd w:id="18"/>
@@ -2070,7 +2102,7 @@
         <w:pStyle w:val="BlockText"/>
         <w:keepNext/>
         <w:keepLines/>
-        <w:jc w:val="both"/>
+        <w:jc w:val="left"/>
       </w:pPr>
       <w:r>
         <w:rPr>
@@ -2099,7 +2131,7 @@
       <w:pPr>
         <w:pStyle w:val="BlockText"/>
         <w:keepLines/>
-        <w:jc w:val="both"/>
+        <w:jc w:val="left"/>
       </w:pPr>
       <w:r>
         <w:rPr>
@@ -2144,6 +2176,7 @@
         <w:pStyle w:val="BlockText"/>
         <w:keepNext/>
         <w:keepLines/>
+        <w:jc w:val="left"/>
         <w:rPr>
           <w:b/>
           <w:bCs/>
@@ -2155,6 +2188,7 @@
         <w:pStyle w:val="BlockText"/>
         <w:keepNext/>
         <w:keepLines/>
+        <w:jc w:val="left"/>
       </w:pPr>
       <w:r>
         <w:rPr>
@@ -2183,6 +2217,7 @@
       <w:pPr>
         <w:pStyle w:val="BlockText"/>
         <w:keepLines/>
+        <w:jc w:val="left"/>
         <w:rPr>
           <w:i/>
           <w:iCs/>
@@ -2255,6 +2290,7 @@
         <w:pStyle w:val="BlockText"/>
         <w:keepNext/>
         <w:keepLines/>
+        <w:jc w:val="left"/>
       </w:pPr>
       <w:r>
         <w:rPr>
@@ -2283,6 +2319,7 @@
       <w:pPr>
         <w:pStyle w:val="BlockText"/>
         <w:keepLines/>
+        <w:jc w:val="left"/>
         <w:rPr>
           <w:i/>
           <w:iCs/>
@@ -2334,7 +2371,7 @@
     <w:p>
       <w:pPr>
         <w:pStyle w:val="Heading3"/>
-        <w:jc w:val="both"/>
+        <w:jc w:val="left"/>
       </w:pPr>
       <w:bookmarkStart w:id="20" w:name="X465397551c79621803eb45cea87c617818668d5"/>
       <w:r>
@@ -2625,7 +2662,7 @@
     <w:p>
       <w:pPr>
         <w:pStyle w:val="Heading2"/>
-        <w:jc w:val="both"/>
+        <w:jc w:val="left"/>
       </w:pPr>
       <w:bookmarkStart w:id="21" w:name="sec:robustness"/>
       <w:bookmarkEnd w:id="19"/>
@@ -2672,7 +2709,7 @@
     <w:p>
       <w:pPr>
         <w:pStyle w:val="Heading2"/>
-        <w:jc w:val="both"/>
+        <w:jc w:val="left"/>
       </w:pPr>
       <w:bookmarkStart w:id="22" w:name="other-spatiotemporal-gait-parameters"/>
       <w:bookmarkEnd w:id="21"/>
@@ -2901,7 +2938,7 @@
         <w:pStyle w:val="BlockText"/>
         <w:keepNext/>
         <w:keepLines/>
-        <w:jc w:val="both"/>
+        <w:jc w:val="left"/>
       </w:pPr>
       <w:r>
         <w:rPr>
@@ -2930,7 +2967,7 @@
       <w:pPr>
         <w:pStyle w:val="BlockText"/>
         <w:keepLines/>
-        <w:jc w:val="both"/>
+        <w:jc w:val="left"/>
         <w:rPr>
           <w:i/>
           <w:iCs/>
@@ -2945,6 +2982,9 @@
       </w:r>
     </w:p>
     <w:p>
+      <w:pPr>
+        <w:jc w:val="left"/>
+      </w:pPr>
       <w:r>
         <w:br w:type="page"/>
       </w:r>
@@ -2952,6 +2992,7 @@
     <w:p>
       <w:pPr>
         <w:pStyle w:val="Heading1"/>
+        <w:jc w:val="left"/>
       </w:pPr>
       <w:bookmarkStart w:id="23" w:name="discussion"/>
       <w:bookmarkEnd w:id="16"/>
@@ -3223,7 +3264,7 @@
     <w:p>
       <w:pPr>
         <w:pStyle w:val="Heading1"/>
-        <w:jc w:val="both"/>
+        <w:jc w:val="left"/>
       </w:pPr>
       <w:bookmarkStart w:id="24" w:name="conclusions"/>
       <w:bookmarkEnd w:id="23"/>
@@ -3242,6 +3283,9 @@
       </w:r>
     </w:p>
     <w:p>
+      <w:pPr>
+        <w:jc w:val="left"/>
+      </w:pPr>
       <w:r>
         <w:br w:type="page"/>
       </w:r>
@@ -3249,7 +3293,7 @@
     <w:p>
       <w:pPr>
         <w:pStyle w:val="Heading1"/>
-        <w:jc w:val="both"/>
+        <w:jc w:val="left"/>
       </w:pPr>
       <w:bookmarkStart w:id="25" w:name="acknowledgements"/>
       <w:bookmarkEnd w:id="24"/>
@@ -3271,7 +3315,7 @@
     <w:p>
       <w:pPr>
         <w:pStyle w:val="Heading1"/>
-        <w:jc w:val="both"/>
+        <w:jc w:val="left"/>
       </w:pPr>
       <w:bookmarkStart w:id="26" w:name="funding"/>
       <w:bookmarkEnd w:id="25"/>
@@ -3292,7 +3336,7 @@
     <w:p>
       <w:pPr>
         <w:pStyle w:val="Heading1"/>
-        <w:jc w:val="both"/>
+        <w:jc w:val="left"/>
       </w:pPr>
       <w:bookmarkStart w:id="27" w:name="competing-interests"/>
       <w:bookmarkEnd w:id="26"/>
@@ -3313,7 +3357,7 @@
     <w:p>
       <w:pPr>
         <w:pStyle w:val="Heading1"/>
-        <w:jc w:val="both"/>
+        <w:jc w:val="left"/>
       </w:pPr>
       <w:bookmarkStart w:id="28" w:name="author-contributions"/>
       <w:bookmarkEnd w:id="27"/>
@@ -3427,7 +3471,7 @@
     <w:p>
       <w:pPr>
         <w:pStyle w:val="Heading1"/>
-        <w:jc w:val="both"/>
+        <w:jc w:val="left"/>
       </w:pPr>
       <w:bookmarkStart w:id="29" w:name="human-ethics"/>
       <w:bookmarkEnd w:id="28"/>
@@ -3448,7 +3492,7 @@
     <w:p>
       <w:pPr>
         <w:pStyle w:val="Heading1"/>
-        <w:jc w:val="both"/>
+        <w:jc w:val="left"/>
       </w:pPr>
       <w:bookmarkStart w:id="30" w:name="data-availability"/>
       <w:bookmarkEnd w:id="29"/>
@@ -3467,6 +3511,9 @@
       </w:r>
     </w:p>
     <w:p>
+      <w:pPr>
+        <w:jc w:val="left"/>
+      </w:pPr>
       <w:r>
         <w:br w:type="page"/>
       </w:r>
@@ -3474,6 +3521,7 @@
     <w:p>
       <w:pPr>
         <w:pStyle w:val="Heading1"/>
+        <w:jc w:val="left"/>
       </w:pPr>
       <w:bookmarkStart w:id="31" w:name="bibliography"/>
       <w:bookmarkEnd w:id="30"/>
@@ -3486,6 +3534,7 @@
       <w:pPr>
         <w:pStyle w:val="Bibliography"/>
         <w:spacing w:after="120" w:line="480" w:lineRule="auto"/>
+        <w:jc w:val="both"/>
       </w:pPr>
       <w:bookmarkStart w:id="32" w:name="ref-Arens2021"/>
       <w:bookmarkStart w:id="33" w:name="refs"/>
@@ -3518,6 +3567,7 @@
       <w:pPr>
         <w:pStyle w:val="Bibliography"/>
         <w:spacing w:after="120" w:line="480" w:lineRule="auto"/>
+        <w:jc w:val="both"/>
       </w:pPr>
       <w:bookmarkStart w:id="34" w:name="ref-Beauchet2005"/>
       <w:bookmarkEnd w:id="32"/>
@@ -3550,6 +3600,7 @@
       <w:pPr>
         <w:pStyle w:val="Bibliography"/>
         <w:spacing w:after="120" w:line="480" w:lineRule="auto"/>
+        <w:jc w:val="both"/>
       </w:pPr>
       <w:bookmarkStart w:id="35" w:name="ref-Bland1986"/>
       <w:bookmarkEnd w:id="34"/>
@@ -3582,6 +3633,7 @@
       <w:pPr>
         <w:pStyle w:val="Bibliography"/>
         <w:spacing w:after="120" w:line="480" w:lineRule="auto"/>
+        <w:jc w:val="both"/>
       </w:pPr>
       <w:bookmarkStart w:id="36" w:name="ref-Boutaayamou2025"/>
       <w:bookmarkEnd w:id="35"/>
@@ -3614,6 +3666,7 @@
       <w:pPr>
         <w:pStyle w:val="Bibliography"/>
         <w:spacing w:after="120" w:line="480" w:lineRule="auto"/>
+        <w:jc w:val="both"/>
       </w:pPr>
       <w:bookmarkStart w:id="37" w:name="ref-Bytyci2021"/>
       <w:bookmarkEnd w:id="36"/>
@@ -3646,6 +3699,7 @@
       <w:pPr>
         <w:pStyle w:val="Bibliography"/>
         <w:spacing w:after="120" w:line="480" w:lineRule="auto"/>
+        <w:jc w:val="both"/>
       </w:pPr>
       <w:bookmarkStart w:id="38" w:name="ref-Commandeur2018"/>
       <w:bookmarkEnd w:id="37"/>
@@ -3678,6 +3732,7 @@
       <w:pPr>
         <w:pStyle w:val="Bibliography"/>
         <w:spacing w:after="120" w:line="480" w:lineRule="auto"/>
+        <w:jc w:val="both"/>
       </w:pPr>
       <w:bookmarkStart w:id="39" w:name="ref-Ensink2023"/>
       <w:bookmarkEnd w:id="38"/>
@@ -3711,6 +3766,7 @@
       <w:pPr>
         <w:pStyle w:val="Bibliography"/>
         <w:spacing w:after="120" w:line="480" w:lineRule="auto"/>
+        <w:jc w:val="both"/>
       </w:pPr>
       <w:bookmarkStart w:id="40" w:name="ref-Foxlin2005"/>
       <w:bookmarkEnd w:id="39"/>
@@ -3743,6 +3799,7 @@
       <w:pPr>
         <w:pStyle w:val="Bibliography"/>
         <w:spacing w:after="120" w:line="480" w:lineRule="auto"/>
+        <w:jc w:val="both"/>
       </w:pPr>
       <w:bookmarkStart w:id="41" w:name="ref-Greene2010"/>
       <w:bookmarkEnd w:id="40"/>
@@ -3775,6 +3832,7 @@
       <w:pPr>
         <w:pStyle w:val="Bibliography"/>
         <w:spacing w:after="120" w:line="480" w:lineRule="auto"/>
+        <w:jc w:val="both"/>
       </w:pPr>
       <w:bookmarkStart w:id="42" w:name="ref-Hannink2017"/>
       <w:bookmarkEnd w:id="41"/>
@@ -3807,6 +3865,7 @@
       <w:pPr>
         <w:pStyle w:val="Bibliography"/>
         <w:spacing w:after="120" w:line="480" w:lineRule="auto"/>
+        <w:jc w:val="both"/>
       </w:pPr>
       <w:bookmarkStart w:id="43" w:name="ref-Hausdorff2008"/>
       <w:bookmarkEnd w:id="42"/>
@@ -3839,6 +3898,7 @@
       <w:pPr>
         <w:pStyle w:val="Bibliography"/>
         <w:spacing w:after="120" w:line="480" w:lineRule="auto"/>
+        <w:jc w:val="both"/>
       </w:pPr>
       <w:bookmarkStart w:id="44" w:name="ref-Kottner2011"/>
       <w:bookmarkEnd w:id="43"/>
@@ -3871,6 +3931,7 @@
       <w:pPr>
         <w:pStyle w:val="Bibliography"/>
         <w:spacing w:after="120" w:line="480" w:lineRule="auto"/>
+        <w:jc w:val="both"/>
       </w:pPr>
       <w:bookmarkStart w:id="45" w:name="ref-Kuderle2022"/>
       <w:bookmarkEnd w:id="44"/>
@@ -3907,6 +3968,7 @@
       <w:pPr>
         <w:pStyle w:val="Bibliography"/>
         <w:spacing w:after="120" w:line="480" w:lineRule="auto"/>
+        <w:jc w:val="both"/>
       </w:pPr>
       <w:bookmarkStart w:id="46" w:name="ref-Laidig2021"/>
       <w:bookmarkEnd w:id="45"/>
@@ -3939,6 +4001,7 @@
       <w:pPr>
         <w:pStyle w:val="Bibliography"/>
         <w:spacing w:after="120" w:line="480" w:lineRule="auto"/>
+        <w:jc w:val="both"/>
       </w:pPr>
       <w:bookmarkStart w:id="47" w:name="ref-Li2023"/>
       <w:bookmarkEnd w:id="46"/>
@@ -3971,6 +4034,7 @@
       <w:pPr>
         <w:pStyle w:val="Bibliography"/>
         <w:spacing w:after="120" w:line="480" w:lineRule="auto"/>
+        <w:jc w:val="both"/>
       </w:pPr>
       <w:bookmarkStart w:id="48" w:name="ref-Lin2025"/>
       <w:bookmarkEnd w:id="47"/>
@@ -4003,6 +4067,7 @@
       <w:pPr>
         <w:pStyle w:val="Bibliography"/>
         <w:spacing w:after="120" w:line="480" w:lineRule="auto"/>
+        <w:jc w:val="both"/>
       </w:pPr>
       <w:bookmarkStart w:id="49" w:name="ref-Luo2024"/>
       <w:bookmarkEnd w:id="48"/>
@@ -4035,6 +4100,7 @@
       <w:pPr>
         <w:pStyle w:val="Bibliography"/>
         <w:spacing w:after="120" w:line="480" w:lineRule="auto"/>
+        <w:jc w:val="both"/>
       </w:pPr>
       <w:bookmarkStart w:id="50" w:name="ref-Mahony2008"/>
       <w:bookmarkEnd w:id="49"/>
@@ -4067,6 +4133,7 @@
       <w:pPr>
         <w:pStyle w:val="Bibliography"/>
         <w:spacing w:after="120" w:line="480" w:lineRule="auto"/>
+        <w:jc w:val="both"/>
       </w:pPr>
       <w:bookmarkStart w:id="51" w:name="ref-Maki1997"/>
       <w:bookmarkEnd w:id="50"/>
@@ -4099,6 +4166,7 @@
       <w:pPr>
         <w:pStyle w:val="Bibliography"/>
         <w:spacing w:after="120" w:line="480" w:lineRule="auto"/>
+        <w:jc w:val="both"/>
       </w:pPr>
       <w:bookmarkStart w:id="52" w:name="ref-Mariani2010"/>
       <w:bookmarkEnd w:id="51"/>
@@ -4135,6 +4203,7 @@
       <w:pPr>
         <w:pStyle w:val="Bibliography"/>
         <w:spacing w:after="120" w:line="480" w:lineRule="auto"/>
+        <w:jc w:val="both"/>
       </w:pPr>
       <w:bookmarkStart w:id="53" w:name="ref-Montero-Odasso2012"/>
       <w:bookmarkEnd w:id="52"/>
@@ -4167,6 +4236,7 @@
       <w:pPr>
         <w:pStyle w:val="Bibliography"/>
         <w:spacing w:after="120" w:line="480" w:lineRule="auto"/>
+        <w:jc w:val="both"/>
       </w:pPr>
       <w:bookmarkStart w:id="54" w:name="ref-Morris2019"/>
       <w:bookmarkEnd w:id="53"/>
@@ -4199,6 +4269,7 @@
       <w:pPr>
         <w:pStyle w:val="Bibliography"/>
         <w:spacing w:after="120" w:line="480" w:lineRule="auto"/>
+        <w:jc w:val="both"/>
       </w:pPr>
       <w:bookmarkStart w:id="55" w:name="ref-Nasreddine2005"/>
       <w:bookmarkEnd w:id="54"/>
@@ -4231,6 +4302,7 @@
       <w:pPr>
         <w:pStyle w:val="Bibliography"/>
         <w:spacing w:after="120" w:line="480" w:lineRule="auto"/>
+        <w:jc w:val="both"/>
       </w:pPr>
       <w:bookmarkStart w:id="56" w:name="ref-Nilsson2012"/>
       <w:bookmarkEnd w:id="55"/>
@@ -4263,6 +4335,7 @@
       <w:pPr>
         <w:pStyle w:val="Bibliography"/>
         <w:spacing w:after="120" w:line="480" w:lineRule="auto"/>
+        <w:jc w:val="both"/>
       </w:pPr>
       <w:bookmarkStart w:id="57" w:name="ref-Rampp2015"/>
       <w:bookmarkEnd w:id="56"/>
@@ -4295,6 +4368,7 @@
       <w:pPr>
         <w:pStyle w:val="Bibliography"/>
         <w:spacing w:after="120" w:line="480" w:lineRule="auto"/>
+        <w:jc w:val="both"/>
       </w:pPr>
       <w:bookmarkStart w:id="58" w:name="ref-Salarian2004"/>
       <w:bookmarkEnd w:id="57"/>
@@ -4328,6 +4402,7 @@
       <w:pPr>
         <w:pStyle w:val="Bibliography"/>
         <w:spacing w:after="120" w:line="480" w:lineRule="auto"/>
+        <w:jc w:val="both"/>
       </w:pPr>
       <w:bookmarkStart w:id="59" w:name="ref-Shrout1979"/>
       <w:bookmarkEnd w:id="58"/>
@@ -4360,6 +4435,7 @@
       <w:pPr>
         <w:pStyle w:val="Bibliography"/>
         <w:spacing w:after="120" w:line="480" w:lineRule="auto"/>
+        <w:jc w:val="both"/>
       </w:pPr>
       <w:bookmarkStart w:id="60" w:name="ref-Sijobert2015"/>
       <w:bookmarkEnd w:id="59"/>
@@ -4392,6 +4468,7 @@
       <w:pPr>
         <w:pStyle w:val="Bibliography"/>
         <w:spacing w:after="120" w:line="480" w:lineRule="auto"/>
+        <w:jc w:val="both"/>
       </w:pPr>
       <w:bookmarkStart w:id="61" w:name="ref-Skog2010"/>
       <w:bookmarkEnd w:id="60"/>
@@ -4424,6 +4501,7 @@
       <w:pPr>
         <w:pStyle w:val="Bibliography"/>
         <w:spacing w:after="120" w:line="480" w:lineRule="auto"/>
+        <w:jc w:val="both"/>
       </w:pPr>
       <w:bookmarkStart w:id="62" w:name="ref-Springer2006"/>
       <w:bookmarkEnd w:id="61"/>
@@ -4456,6 +4534,7 @@
       <w:pPr>
         <w:pStyle w:val="Bibliography"/>
         <w:spacing w:after="120" w:line="480" w:lineRule="auto"/>
+        <w:jc w:val="both"/>
       </w:pPr>
       <w:bookmarkStart w:id="63" w:name="ref-Trojaniello2014"/>
       <w:bookmarkEnd w:id="62"/>
@@ -4488,6 +4567,7 @@
       <w:pPr>
         <w:pStyle w:val="Bibliography"/>
         <w:spacing w:after="120" w:line="480" w:lineRule="auto"/>
+        <w:jc w:val="both"/>
       </w:pPr>
       <w:bookmarkStart w:id="64" w:name="ref-Verghese2009"/>
       <w:bookmarkEnd w:id="63"/>
@@ -4521,6 +4601,7 @@
       <w:pPr>
         <w:pStyle w:val="Bibliography"/>
         <w:spacing w:after="120" w:line="480" w:lineRule="auto"/>
+        <w:jc w:val="both"/>
       </w:pPr>
       <w:bookmarkStart w:id="65" w:name="ref-Wahlstrom2020"/>
       <w:bookmarkEnd w:id="64"/>
@@ -4553,6 +4634,7 @@
       <w:pPr>
         <w:pStyle w:val="Bibliography"/>
         <w:spacing w:after="120" w:line="480" w:lineRule="auto"/>
+        <w:jc w:val="both"/>
       </w:pPr>
       <w:bookmarkStart w:id="66" w:name="ref-Washabaugh2017"/>
       <w:bookmarkEnd w:id="65"/>
@@ -4585,6 +4667,7 @@
       <w:pPr>
         <w:pStyle w:val="Bibliography"/>
         <w:spacing w:after="120" w:line="480" w:lineRule="auto"/>
+        <w:jc w:val="both"/>
       </w:pPr>
       <w:bookmarkStart w:id="67" w:name="ref-Webster2005"/>
       <w:bookmarkEnd w:id="66"/>
@@ -4629,6 +4712,7 @@
       <w:pPr>
         <w:pStyle w:val="Bibliography"/>
         <w:spacing w:after="120" w:line="480" w:lineRule="auto"/>
+        <w:jc w:val="both"/>
       </w:pPr>
       <w:bookmarkStart w:id="68" w:name="ref-Yogev-Seligmann2008"/>
       <w:bookmarkEnd w:id="67"/>

</xml_diff>

<commit_message>
Add Borealis data DOI to manuscript
</commit_message>
<xml_diff>
--- a/manuscript/manuscript_submission.docx
+++ b/manuscript/manuscript_submission.docx
@@ -3507,7 +3507,31 @@
         <w:jc w:val="both"/>
       </w:pPr>
       <w:r>
-        <w:t>We will deposit the de-identified stride-level data and the analysis code that support the findings of this study in a public repository (Zenodo) and release them under an open licence upon publication. We will additionally host the analysis code on GitHub, and we will provide a persistent DOI and the repository URL at that time.</w:t>
+        <w:t xml:space="preserve">The de-identified raw synchronized heel-mounted IMU and GaitRite recordings, derived stride-level data, metadata, and documentation supporting this study will be deposited in Borealis, the Canadian Dataverse Repository, under the reserved DOI </w:t>
+      </w:r>
+      <w:hyperlink r:id="rId48" w:history="1">
+        <w:r>
+          <w:rPr>
+            <w:color w:val="0563C1"/>
+            <w:u w:val="single"/>
+          </w:rPr>
+          <w:t>https://doi.org/10.5683/SP4/7YSHYF</w:t>
+        </w:r>
+      </w:hyperlink>
+      <w:r>
+        <w:t xml:space="preserve">. Analysis code will be released through the </w:t>
+      </w:r>
+      <w:hyperlink r:id="rId49" w:history="1">
+        <w:r>
+          <w:rPr>
+            <w:color w:val="0563C1"/>
+            <w:u w:val="single"/>
+          </w:rPr>
+          <w:t>project GitHub repository</w:t>
+        </w:r>
+      </w:hyperlink>
+      <w:r>
+        <w:t>.</w:t>
       </w:r>
     </w:p>
     <w:p>

</xml_diff>

<commit_message>
chore: finalize submission package and data access
</commit_message>
<xml_diff>
--- a/manuscript/manuscript_submission.docx
+++ b/manuscript/manuscript_submission.docx
@@ -3243,22 +3243,31 @@
     <w:p>
       <w:pPr>
         <w:pStyle w:val="BodyText"/>
-        <w:spacing w:after="120" w:line="480" w:lineRule="auto"/>
-        <w:jc w:val="both"/>
-      </w:pPr>
-      <w:r>
-        <w:rPr>
-          <w:b/>
-          <w:bCs/>
-        </w:rPr>
-        <w:t>Five design constraints limit generalisation of our results.</w:t>
-      </w:r>
-      <w:r>
-        <w:t xml:space="preserve"> First, GaitRite ground truth covers only supervised, straight strides across a 6.1 m walkway. The protocol did not test turns, uneven surfaces, stops, footwear variation, long continuous bouts, or unsupervised activity. It therefore cannot establish everyday-living accuracy or validate the bilateral detector’s intended rejection of non-walking events. Those questions require a longer-duration criterion such as synchronised video or wearable-compatible motion capture. Second, participants walked independently with relatively typical gait patterns and the sample skewed towards female (24 of 32 participants). Generalisation to severe gait impairments and sex-specific accuracy claims remains untested. Third, cognitive classification relied on MoCA screening rather than formal neuropsychological </w:t>
-      </w:r>
-      <w:r>
-        <w:lastRenderedPageBreak/>
-        <w:t>assessment. The subgroup findings concern screening categories, not diagnostic discrimination or disease monitoring. Fourth, the retroactive correction adds one-stride latency and prevents real-time estimation, although it does not affect offline applications. Fifth, single-session data leave test-retest reliability and responsiveness to clinical change untested.</w:t>
+        <w:widowControl/>
+        <w:spacing w:line="480" w:lineRule="auto" w:after="120"/>
+        <w:jc w:val="both"/>
+      </w:pPr>
+      <w:r>
+        <w:rPr>
+          <w:b/>
+          <w:bCs/>
+        </w:rPr>
+        <w:t xml:space="preserve">Five design constraints limit generalisation of our results.</w:t>
+      </w:r>
+      <w:r>
+        <w:t xml:space="preserve"> </w:t>
+      </w:r>
+      <w:r>
+        <w:t xml:space="preserve">First, GaitRite ground truth covers only supervised, straight strides across a 6.1 m walkway. The protocol did not test turns, uneven surfaces, stops, footwear variation, long continuous bouts, or unsupervised activity. It therefore cannot establish everyday-living accuracy or validate the bilateral detector’s intended rejection of non-walking events. Those questions require a longer-duration criterion such as synchronised video or wearable-compatible motion capture. Second, participants walked independently with relatively typical gait patterns and the sample skewed towards female (24 of 32 participants). Generalisation to severe gait impairments and sex-specific accuracy claims remains untested. Post-stroke gait can include compensatory movements and speed-dependent changes in stability, so the present accuracy estimates should not be extended to these gait patterns without direct validation</w:t>
+      </w:r>
+      <w:r>
+        <w:t xml:space="preserve"> </w:t>
+      </w:r>
+      <w:r>
+        <w:t xml:space="preserve">(Awad et al. 2017, 2023)</w:t>
+      </w:r>
+      <w:r>
+        <w:t xml:space="preserve">. Third, cognitive classification relied on MoCA screening rather than formal neuropsychological assessment. The subgroup findings concern screening categories, not diagnostic discrimination or disease monitoring. Fourth, the retroactive correction adds one-stride latency and prevents real-time estimation, although it does not affect offline applications. Fifth, single-session data leave test-retest reliability and responsiveness to clinical change untested.</w:t>
       </w:r>
     </w:p>
     <w:p>
@@ -3326,11 +3335,12 @@
     <w:p>
       <w:pPr>
         <w:pStyle w:val="FirstParagraph"/>
-        <w:spacing w:after="120" w:line="480" w:lineRule="auto"/>
-        <w:jc w:val="both"/>
-      </w:pPr>
-      <w:r>
-        <w:t>The authors received no specific funding for this work.</w:t>
+        <w:widowControl/>
+        <w:spacing w:line="480" w:lineRule="auto" w:after="120"/>
+        <w:jc w:val="both"/>
+      </w:pPr>
+      <w:r>
+        <w:t xml:space="preserve">This work was supported by the Alzheimer Society of BC and Yukon (formerly the Alzheimer Society of B.C.).</w:t>
       </w:r>
     </w:p>
     <w:p>
@@ -3503,35 +3513,40 @@
     <w:p>
       <w:pPr>
         <w:pStyle w:val="FirstParagraph"/>
-        <w:spacing w:after="120" w:line="480" w:lineRule="auto"/>
-        <w:jc w:val="both"/>
-      </w:pPr>
-      <w:r>
-        <w:t xml:space="preserve">The de-identified raw synchronized heel-mounted IMU and GaitRite recordings, derived stride-level data, metadata, and documentation supporting this study will be deposited in Borealis, the Canadian Dataverse Repository, under the reserved DOI </w:t>
-      </w:r>
-      <w:hyperlink r:id="rId48" w:history="1">
+        <w:widowControl/>
+        <w:spacing w:line="480" w:lineRule="auto" w:after="120"/>
+        <w:jc w:val="both"/>
+      </w:pPr>
+      <w:r>
+        <w:t xml:space="preserve">Aggregate statistical results, metadata, and documentation supporting this study will be deposited in Borealis, the Canadian Dataverse Repository, under the reserved DOI</w:t>
+      </w:r>
+      <w:r>
+        <w:t xml:space="preserve"> </w:t>
+      </w:r>
+      <w:hyperlink r:id="rId39">
         <w:r>
           <w:rPr>
-            <w:color w:val="0563C1"/>
-            <w:u w:val="single"/>
-          </w:rPr>
-          <w:t>https://doi.org/10.5683/SP4/7YSHYF</w:t>
+            <w:rStyle w:val="Hyperlink"/>
+          </w:rPr>
+          <w:t xml:space="preserve">https://doi.org/10.5683/SP4/7YSHYF</w:t>
         </w:r>
       </w:hyperlink>
       <w:r>
-        <w:t xml:space="preserve">. Analysis code will be released through the </w:t>
-      </w:r>
-      <w:hyperlink r:id="rId49" w:history="1">
+        <w:t xml:space="preserve">. Participant-level sensor recordings, GaitRite files, synchronization records, and derived records are not publicly available because the approved ethics protocol restricts de-identified data access to approved research personnel and does not permit web storage. Analysis code will be released through the</w:t>
+      </w:r>
+      <w:r>
+        <w:t xml:space="preserve"> </w:t>
+      </w:r>
+      <w:hyperlink r:id="rId40">
         <w:r>
           <w:rPr>
-            <w:color w:val="0563C1"/>
-            <w:u w:val="single"/>
-          </w:rPr>
-          <w:t>project GitHub repository</w:t>
+            <w:rStyle w:val="Hyperlink"/>
+          </w:rPr>
+          <w:t xml:space="preserve">project GitHub repository</w:t>
         </w:r>
       </w:hyperlink>
       <w:r>
-        <w:t>.</w:t>
+        <w:t xml:space="preserve">.</w:t>
       </w:r>
     </w:p>
     <w:p>
@@ -3585,6 +3600,100 @@
       </w:hyperlink>
       <w:r>
         <w:t>.</w:t>
+      </w:r>
+    </w:p>
+    <w:p>
+      <w:pPr>
+        <w:pStyle w:val="Bibliography"/>
+        <w:widowControl/>
+        <w:spacing w:line="480" w:lineRule="auto" w:after="120"/>
+        <w:jc w:val="both"/>
+      </w:pPr>
+      <w:r>
+        <w:t xml:space="preserve">Awad, Louis N., Jaehyun Bae, Pawel Kudzia, et al. 2017.</w:t>
+      </w:r>
+      <w:r>
+        <w:t xml:space="preserve"> </w:t>
+      </w:r>
+      <w:r>
+        <w:t xml:space="preserve">“Reducing Circumduction and Hip Hiking During Hemiparetic Walking Through Targeted Assistance of the Paretic Limb Using a Soft Robotic Exosuit.”</w:t>
+      </w:r>
+      <w:r>
+        <w:t xml:space="preserve"> </w:t>
+      </w:r>
+      <w:r>
+        <w:rPr>
+          <w:i/>
+          <w:iCs/>
+        </w:rPr>
+        <w:t xml:space="preserve">American Journal of Physical Medicine &amp; Rehabilitation</w:t>
+      </w:r>
+      <w:r>
+        <w:t xml:space="preserve"> </w:t>
+      </w:r>
+      <w:r>
+        <w:t xml:space="preserve">96 (10 Suppl 1): S157–64.</w:t>
+      </w:r>
+      <w:r>
+        <w:t xml:space="preserve"> </w:t>
+      </w:r>
+      <w:hyperlink r:id="rId44">
+        <w:r>
+          <w:rPr>
+            <w:rStyle w:val="Hyperlink"/>
+          </w:rPr>
+          <w:t xml:space="preserve">https://doi.org/10.1097/PHM.0000000000000800</w:t>
+        </w:r>
+      </w:hyperlink>
+      <w:r>
+        <w:t xml:space="preserve">.</w:t>
+      </w:r>
+    </w:p>
+    <w:p>
+      <w:pPr>
+        <w:pStyle w:val="Bibliography"/>
+        <w:widowControl/>
+        <w:spacing w:line="480" w:lineRule="auto" w:after="120"/>
+        <w:jc w:val="both"/>
+      </w:pPr>
+      <w:r>
+        <w:t xml:space="preserve">Awad, Louis N., Brian A. Knarr, Pawel Kudzia, and Thomas S. Buchanan. 2023.</w:t>
+      </w:r>
+      <w:r>
+        <w:t xml:space="preserve"> </w:t>
+      </w:r>
+      <w:r>
+        <w:t xml:space="preserve">“The Interplay Between Walking Speed, Economy, and Stability After Stroke.”</w:t>
+      </w:r>
+      <w:r>
+        <w:t xml:space="preserve"> </w:t>
+      </w:r>
+      <w:r>
+        <w:rPr>
+          <w:i/>
+          <w:iCs/>
+        </w:rPr>
+        <w:t xml:space="preserve">Journal of Neurologic Physical Therapy</w:t>
+      </w:r>
+      <w:r>
+        <w:t xml:space="preserve"> </w:t>
+      </w:r>
+      <w:r>
+        <w:t xml:space="preserve">47 (2): 75–83.</w:t>
+      </w:r>
+      <w:r>
+        <w:t xml:space="preserve"> </w:t>
+      </w:r>
+      <w:hyperlink r:id="rId46">
+        <w:r>
+          <w:rPr>
+            <w:rStyle w:val="Hyperlink"/>
+          </w:rPr>
+          <w:t xml:space="preserve">https://doi.org/10.1097/NPT.0000000000000431</w:t>
+        </w:r>
+      </w:hyperlink>
+      <w:r>
+        <w:t xml:space="preserve">.</w:t>
       </w:r>
     </w:p>
     <w:p>

</xml_diff>